<commit_message>
fix quarto system info output
</commit_message>
<xml_diff>
--- a/_site/mia226-mi_system_info.docx
+++ b/_site/mia226-mi_system_info.docx
@@ -23,7 +23,7 @@
         <w:pStyle w:val="Author"/>
       </w:pPr>
       <w:r>
-        <w:t xml:space="preserve">Your Name</w:t>
+        <w:t xml:space="preserve">Miao Liu</w:t>
       </w:r>
     </w:p>
     <w:p>
@@ -97,9 +97,11 @@
       <w:r>
         <w:t xml:space="preserve">mem = psutil.virtual_memory()</w:t>
       </w:r>
-      <w:r>
-        <w:t xml:space="preserve"> </w:t>
-      </w:r>
+    </w:p>
+    <w:p>
+      <w:pPr>
+        <w:pStyle w:val="BodyText"/>
+      </w:pPr>
       <w:r>
         <w:t xml:space="preserve">print(</w:t>
       </w:r>

</xml_diff>